<commit_message>
Update user guide to v1.1 with all recent changes
- Account search: 5-char auto-search, no button needed
- Auto-select Extreme Networks Corp for internal-only meetings
- Opportunity dropdown now shows deal Amount
- PKI certificate replacing dev certs; CA auto-trust on install
- Manifest URL updated to GitHub Pages (application/xml)
- Windows installer section added
- Proxy self-update mechanism documented (checks GitHub every 6h)
- New Updates section covering proxy, frontend, and cert renewal
- Troubleshooting expanded with certificate and sideload warning entries
- launchctl bootstrap/bootout commands in troubleshooting steps

Co-Authored-By: Claude Sonnet 4.6 <noreply@anthropic.com>
</commit_message>
<xml_diff>
--- a/SEAssist-UserGuide.docx
+++ b/SEAssist-UserGuide.docx
@@ -118,7 +118,7 @@
                 <w:sz w:val="36"/>
                 <w:szCs w:val="36"/>
               </w:rPr>
-              <w:t xml:space="preserve">User Guide</w:t>
+              <w:t xml:space="preserve">User Guide  ·  v1.1</w:t>
             </w:r>
           </w:p>
           <w:p>
@@ -267,7 +267,7 @@
         <w:rPr>
           <w:rFonts w:ascii="Arial" w:cs="Arial" w:eastAsia="Arial" w:hAnsi="Arial"/>
         </w:rPr>
-        <w:t xml:space="preserve">from participant email domains</w:t>
+        <w:t xml:space="preserve">from participant email domains; internal-only meetings pre-select Extreme Networks Corp automatically</w:t>
       </w:r>
     </w:p>
     <w:p>
@@ -291,7 +291,7 @@
         <w:rPr>
           <w:rFonts w:ascii="Arial" w:cs="Arial" w:eastAsia="Arial" w:hAnsi="Arial"/>
         </w:rPr>
-        <w:t xml:space="preserve">for the matched account (open + recently closed)</w:t>
+        <w:t xml:space="preserve">for the matched account (open + recently closed), showing stage and deal amount</w:t>
       </w:r>
     </w:p>
     <w:p>
@@ -315,7 +315,7 @@
         <w:rPr>
           <w:rFonts w:ascii="Arial" w:cs="Arial" w:eastAsia="Arial" w:hAnsi="Arial"/>
         </w:rPr>
-        <w:t xml:space="preserve">from keywords in the subject line (Demo, PoC, Pitch, etc.)</w:t>
+        <w:t xml:space="preserve">from keywords in the subject line (Demo, PoC, Pitch, QBR, etc.)</w:t>
       </w:r>
     </w:p>
     <w:p>
@@ -344,34 +344,6 @@
     </w:p>
     <w:p>
       <w:pPr>
-        <w:spacing w:after="0" w:before="80"/>
-      </w:pPr>
-      <w:r>
-        <w:rPr>
-          <w:rFonts w:ascii="Arial" w:cs="Arial" w:eastAsia="Arial" w:hAnsi="Arial"/>
-        </w:rPr>
-        <w:t xml:space="preserve"/>
-      </w:r>
-    </w:p>
-    <w:p>
-      <w:pPr>
-        <w:pStyle w:val="Heading2"/>
-        <w:spacing w:after="120" w:before="280"/>
-      </w:pPr>
-      <w:r>
-        <w:rPr>
-          <w:rFonts w:ascii="Arial" w:cs="Arial" w:eastAsia="Arial" w:hAnsi="Arial"/>
-          <w:b/>
-          <w:bCs/>
-          <w:color w:val="1E1B4B"/>
-          <w:sz w:val="28"/>
-          <w:szCs w:val="28"/>
-        </w:rPr>
-        <w:t xml:space="preserve">Requirements</w:t>
-      </w:r>
-    </w:p>
-    <w:p>
-      <w:pPr>
         <w:pStyle w:val="ListParagraph"/>
         <w:numPr>
           <w:ilvl w:val="0"/>
@@ -382,8 +354,44 @@
       <w:r>
         <w:rPr>
           <w:rFonts w:ascii="Arial" w:cs="Arial" w:eastAsia="Arial" w:hAnsi="Arial"/>
-        </w:rPr>
-        <w:t xml:space="preserve">Outlook for Mac or Windows (desktop or web)</w:t>
+          <w:b/>
+          <w:bCs/>
+        </w:rPr>
+        <w:t xml:space="preserve">Self-updates </w:t>
+      </w:r>
+      <w:r>
+        <w:rPr>
+          <w:rFonts w:ascii="Arial" w:cs="Arial" w:eastAsia="Arial" w:hAnsi="Arial"/>
+        </w:rPr>
+        <w:t xml:space="preserve">the proxy server automatically — checks GitHub every 6 hours, no reinstallation needed</w:t>
+      </w:r>
+    </w:p>
+    <w:p>
+      <w:pPr>
+        <w:spacing w:after="0" w:before="80"/>
+      </w:pPr>
+      <w:r>
+        <w:rPr>
+          <w:rFonts w:ascii="Arial" w:cs="Arial" w:eastAsia="Arial" w:hAnsi="Arial"/>
+        </w:rPr>
+        <w:t xml:space="preserve"/>
+      </w:r>
+    </w:p>
+    <w:p>
+      <w:pPr>
+        <w:pStyle w:val="Heading2"/>
+        <w:spacing w:after="120" w:before="280"/>
+      </w:pPr>
+      <w:r>
+        <w:rPr>
+          <w:rFonts w:ascii="Arial" w:cs="Arial" w:eastAsia="Arial" w:hAnsi="Arial"/>
+          <w:b/>
+          <w:bCs/>
+          <w:color w:val="1E1B4B"/>
+          <w:sz w:val="28"/>
+          <w:szCs w:val="28"/>
+        </w:rPr>
+        <w:t xml:space="preserve">Requirements</w:t>
       </w:r>
     </w:p>
     <w:p>
@@ -399,7 +407,7 @@
         <w:rPr>
           <w:rFonts w:ascii="Arial" w:cs="Arial" w:eastAsia="Arial" w:hAnsi="Arial"/>
         </w:rPr>
-        <w:t xml:space="preserve">macOS 12+ or Windows 10/11</w:t>
+        <w:t xml:space="preserve">Outlook for Mac or Windows (desktop or web)</w:t>
       </w:r>
     </w:p>
     <w:p>
@@ -415,7 +423,7 @@
         <w:rPr>
           <w:rFonts w:ascii="Arial" w:cs="Arial" w:eastAsia="Arial" w:hAnsi="Arial"/>
         </w:rPr>
-        <w:t xml:space="preserve">Salesforce CLI — installed automatically by the installer</w:t>
+        <w:t xml:space="preserve">macOS 12+ or Windows 10/11</w:t>
       </w:r>
     </w:p>
     <w:p>
@@ -431,7 +439,7 @@
         <w:rPr>
           <w:rFonts w:ascii="Arial" w:cs="Arial" w:eastAsia="Arial" w:hAnsi="Arial"/>
         </w:rPr>
-        <w:t xml:space="preserve">Node.js 18+ — installed automatically by the installer</w:t>
+        <w:t xml:space="preserve">Salesforce CLI, Node.js, CA certificates — all installed automatically by the installer</w:t>
       </w:r>
     </w:p>
     <w:p>
@@ -447,7 +455,7 @@
         <w:rPr>
           <w:rFonts w:ascii="Arial" w:cs="Arial" w:eastAsia="Arial" w:hAnsi="Arial"/>
         </w:rPr>
-        <w:t xml:space="preserve">Internet access to Salesforce (extremesaas.my.salesforce.com)</w:t>
+        <w:t xml:space="preserve">Network access to Salesforce (extremesaas.my.salesforce.com) and pki.extremenetworks.com</w:t>
       </w:r>
     </w:p>
     <w:p>
@@ -483,7 +491,7 @@
         <w:rPr>
           <w:rFonts w:ascii="Arial" w:cs="Arial" w:eastAsia="Arial" w:hAnsi="Arial"/>
         </w:rPr>
-        <w:t xml:space="preserve">The installer handles everything: Node.js, Salesforce CLI, the local proxy server, localhost certificates, and auto-start on login.</w:t>
+        <w:t xml:space="preserve">The installer handles everything: Node.js, Salesforce CLI, the local proxy server, PKI certificates, CA trust, and auto-start on login. No administrator password is required.</w:t>
       </w:r>
     </w:p>
     <w:p>
@@ -528,7 +536,7 @@
         <w:rPr>
           <w:rFonts w:ascii="Arial" w:cs="Arial" w:eastAsia="Arial" w:hAnsi="Arial"/>
         </w:rPr>
-        <w:t xml:space="preserve">Open Terminal and run:</w:t>
+        <w:t xml:space="preserve">Open Terminal and paste:</w:t>
       </w:r>
     </w:p>
     <w:tbl>
@@ -569,8 +577,8 @@
               <w:rPr>
                 <w:rFonts w:ascii="Courier New" w:cs="Courier New" w:eastAsia="Courier New" w:hAnsi="Courier New"/>
                 <w:color w:val="86EFAC"/>
-                <w:sz w:val="20"/>
-                <w:szCs w:val="20"/>
+                <w:sz w:val="18"/>
+                <w:szCs w:val="18"/>
               </w:rPr>
               <w:t xml:space="preserve">curl -fsSL https://raw.githubusercontent.com/NonAlex1/SEAssistPlugin/main/install.sh | bash</w:t>
             </w:r>
@@ -578,6 +586,138 @@
         </w:tc>
       </w:tr>
     </w:tbl>
+    <w:p>
+      <w:pPr>
+        <w:spacing w:after="0" w:before="120"/>
+      </w:pPr>
+      <w:r>
+        <w:rPr>
+          <w:rFonts w:ascii="Arial" w:cs="Arial" w:eastAsia="Arial" w:hAnsi="Arial"/>
+        </w:rPr>
+        <w:t xml:space="preserve"/>
+      </w:r>
+    </w:p>
+    <w:p>
+      <w:pPr>
+        <w:spacing w:after="80" w:before="0"/>
+      </w:pPr>
+      <w:r>
+        <w:rPr>
+          <w:rFonts w:ascii="Arial" w:cs="Arial" w:eastAsia="Arial" w:hAnsi="Arial"/>
+        </w:rPr>
+        <w:t xml:space="preserve">The installer performs these steps automatically:</w:t>
+      </w:r>
+    </w:p>
+    <w:p>
+      <w:pPr>
+        <w:pStyle w:val="ListParagraph"/>
+        <w:numPr>
+          <w:ilvl w:val="0"/>
+          <w:numId w:val="2"/>
+        </w:numPr>
+        <w:spacing w:after="40" w:before="40"/>
+      </w:pPr>
+      <w:r>
+        <w:rPr>
+          <w:rFonts w:ascii="Arial" w:cs="Arial" w:eastAsia="Arial" w:hAnsi="Arial"/>
+        </w:rPr>
+        <w:t xml:space="preserve">Installs Homebrew, Node.js, and Salesforce CLI if not already present</w:t>
+      </w:r>
+    </w:p>
+    <w:p>
+      <w:pPr>
+        <w:pStyle w:val="ListParagraph"/>
+        <w:numPr>
+          <w:ilvl w:val="0"/>
+          <w:numId w:val="2"/>
+        </w:numPr>
+        <w:spacing w:after="40" w:before="40"/>
+      </w:pPr>
+      <w:r>
+        <w:rPr>
+          <w:rFonts w:ascii="Arial" w:cs="Arial" w:eastAsia="Arial" w:hAnsi="Arial"/>
+        </w:rPr>
+        <w:t xml:space="preserve">Downloads the proxy server to ~/.seassist/</w:t>
+      </w:r>
+    </w:p>
+    <w:p>
+      <w:pPr>
+        <w:pStyle w:val="ListParagraph"/>
+        <w:numPr>
+          <w:ilvl w:val="0"/>
+          <w:numId w:val="2"/>
+        </w:numPr>
+        <w:spacing w:after="40" w:before="40"/>
+      </w:pPr>
+      <w:r>
+        <w:rPr>
+          <w:rFonts w:ascii="Arial" w:cs="Arial" w:eastAsia="Arial" w:hAnsi="Arial"/>
+        </w:rPr>
+        <w:t xml:space="preserve">Downloads the PKI certificate and private key from the repository</w:t>
+      </w:r>
+    </w:p>
+    <w:p>
+      <w:pPr>
+        <w:pStyle w:val="ListParagraph"/>
+        <w:numPr>
+          <w:ilvl w:val="0"/>
+          <w:numId w:val="2"/>
+        </w:numPr>
+        <w:spacing w:after="40" w:before="40"/>
+      </w:pPr>
+      <w:r>
+        <w:rPr>
+          <w:rFonts w:ascii="Arial" w:cs="Arial" w:eastAsia="Arial" w:hAnsi="Arial"/>
+        </w:rPr>
+        <w:t xml:space="preserve">Checks if Extreme Networks CA certificates are trusted; </w:t>
+      </w:r>
+      <w:r>
+        <w:rPr>
+          <w:rFonts w:ascii="Arial" w:cs="Arial" w:eastAsia="Arial" w:hAnsi="Arial"/>
+          <w:b/>
+          <w:bCs/>
+        </w:rPr>
+        <w:t xml:space="preserve">installs them automatically</w:t>
+      </w:r>
+      <w:r>
+        <w:rPr>
+          <w:rFonts w:ascii="Arial" w:cs="Arial" w:eastAsia="Arial" w:hAnsi="Arial"/>
+        </w:rPr>
+        <w:t xml:space="preserve"> to your login keychain if not</w:t>
+      </w:r>
+    </w:p>
+    <w:p>
+      <w:pPr>
+        <w:pStyle w:val="ListParagraph"/>
+        <w:numPr>
+          <w:ilvl w:val="0"/>
+          <w:numId w:val="2"/>
+        </w:numPr>
+        <w:spacing w:after="40" w:before="40"/>
+      </w:pPr>
+      <w:r>
+        <w:rPr>
+          <w:rFonts w:ascii="Arial" w:cs="Arial" w:eastAsia="Arial" w:hAnsi="Arial"/>
+        </w:rPr>
+        <w:t xml:space="preserve">Registers a LaunchAgent so the proxy starts automatically at every login</w:t>
+      </w:r>
+    </w:p>
+    <w:p>
+      <w:pPr>
+        <w:pStyle w:val="ListParagraph"/>
+        <w:numPr>
+          <w:ilvl w:val="0"/>
+          <w:numId w:val="2"/>
+        </w:numPr>
+        <w:spacing w:after="40" w:before="40"/>
+      </w:pPr>
+      <w:r>
+        <w:rPr>
+          <w:rFonts w:ascii="Arial" w:cs="Arial" w:eastAsia="Arial" w:hAnsi="Arial"/>
+        </w:rPr>
+        <w:t xml:space="preserve">Downloads the Outlook manifest to ~/Downloads/seassist-manifest.xml</w:t>
+      </w:r>
+    </w:p>
     <w:p>
       <w:pPr>
         <w:spacing w:after="0" w:before="120"/>
@@ -637,7 +777,7 @@
                 <w:rFonts w:ascii="Arial" w:cs="Arial" w:eastAsia="Arial" w:hAnsi="Arial"/>
                 <w:color w:val="1E3A5F"/>
               </w:rPr>
-              <w:t xml:space="preserve">The script installs Homebrew, Node.js, and the Salesforce CLI if they are not already present. No administrator password is needed.</w:t>
+              <w:t xml:space="preserve">The installer is safe to re-run — it skips steps that are already complete and updates the proxy to the latest version.</w:t>
             </w:r>
           </w:p>
         </w:tc>
@@ -676,7 +816,7 @@
         <w:rPr>
           <w:rFonts w:ascii="Arial" w:cs="Arial" w:eastAsia="Arial" w:hAnsi="Arial"/>
         </w:rPr>
-        <w:t xml:space="preserve">The installer prints the manifest URL and saves the manifest file to your Downloads folder. Use whichever option works:</w:t>
+        <w:t xml:space="preserve">The manifest file is saved to your Downloads folder during installation. Use whichever option works:</w:t>
       </w:r>
     </w:p>
     <w:p>
@@ -779,8 +919,18 @@
                 <w:sz w:val="20"/>
                 <w:szCs w:val="20"/>
               </w:rPr>
-              <w:t xml:space="preserve">Outlook → Get Add-ins → My Add-ins → Add a custom add-in → Add from URL
-Paste: https://raw.githubusercontent.com/NonAlex1/SEAssistPlugin/main/manifest.prod.xml</w:t>
+              <w:t xml:space="preserve">Outlook → Get Add-ins → My Add-ins → Add a custom add-in → Add from URL</w:t>
+            </w:r>
+          </w:p>
+          <w:p>
+            <w:r>
+              <w:rPr>
+                <w:rFonts w:ascii="Arial" w:cs="Arial" w:eastAsia="Arial" w:hAnsi="Arial"/>
+                <w:color w:val="475569"/>
+                <w:sz w:val="20"/>
+                <w:szCs w:val="20"/>
+              </w:rPr>
+              <w:t xml:space="preserve">Paste: https://nonalex1.github.io/SEAssistPlugin/manifest.xml</w:t>
             </w:r>
           </w:p>
         </w:tc>
@@ -886,8 +1036,18 @@
                 <w:sz w:val="20"/>
                 <w:szCs w:val="20"/>
               </w:rPr>
-              <w:t xml:space="preserve">Outlook → Get Add-ins → My Add-ins → Add a custom add-in → Add from file
-Select seassist-manifest.xml from your Downloads folder</w:t>
+              <w:t xml:space="preserve">Outlook → Get Add-ins → My Add-ins → Add a custom add-in → Add from file</w:t>
+            </w:r>
+          </w:p>
+          <w:p>
+            <w:r>
+              <w:rPr>
+                <w:rFonts w:ascii="Arial" w:cs="Arial" w:eastAsia="Arial" w:hAnsi="Arial"/>
+                <w:color w:val="475569"/>
+                <w:sz w:val="20"/>
+                <w:szCs w:val="20"/>
+              </w:rPr>
+              <w:t xml:space="preserve">Select seassist-manifest.xml from your Downloads folder</w:t>
             </w:r>
           </w:p>
         </w:tc>
@@ -993,8 +1153,18 @@
                 <w:sz w:val="20"/>
                 <w:szCs w:val="20"/>
               </w:rPr>
-              <w:t xml:space="preserve">Open outlook.office.com → any email → Apps / Get Add-ins → My Add-ins
-Use either Add from URL or Add from file as above</w:t>
+              <w:t xml:space="preserve">Open outlook.office.com → any email → Apps / Get Add-ins → My Add-ins</w:t>
+            </w:r>
+          </w:p>
+          <w:p>
+            <w:r>
+              <w:rPr>
+                <w:rFonts w:ascii="Arial" w:cs="Arial" w:eastAsia="Arial" w:hAnsi="Arial"/>
+                <w:color w:val="475569"/>
+                <w:sz w:val="20"/>
+                <w:szCs w:val="20"/>
+              </w:rPr>
+              <w:t xml:space="preserve">Use either Add from URL or Add from file as above</w:t>
             </w:r>
           </w:p>
         </w:tc>
@@ -1059,21 +1229,15 @@
                 <w:rFonts w:ascii="Arial" w:cs="Arial" w:eastAsia="Arial" w:hAnsi="Arial"/>
                 <w:color w:val="7C2D12"/>
               </w:rPr>
-              <w:t xml:space="preserve">If both URL and file options are grayed out, ask your M365 administrator to deploy the add-in centrally via the Microsoft 365 Admin Center (Settings → Integrated Apps).</w:t>
+              <w:t xml:space="preserve">If all sideloading options are grayed out, ask your M365 administrator to deploy the add-in centrally via Microsoft 365 Admin Center → Settings → Integrated Apps. This bypasses all sideloading restrictions and deploys silently to all users.</w:t>
             </w:r>
           </w:p>
         </w:tc>
       </w:tr>
     </w:tbl>
     <w:p>
-      <w:pPr>
-        <w:spacing w:after="0" w:before="160"/>
-      </w:pPr>
-      <w:r>
-        <w:rPr>
-          <w:rFonts w:ascii="Arial" w:cs="Arial" w:eastAsia="Arial" w:hAnsi="Arial"/>
-        </w:rPr>
-        <w:t xml:space="preserve"/>
+      <w:r>
+        <w:br w:type="page"/>
       </w:r>
     </w:p>
     <w:p>
@@ -1118,7 +1282,7 @@
         <w:rPr>
           <w:rFonts w:ascii="Arial" w:cs="Arial" w:eastAsia="Arial" w:hAnsi="Arial"/>
         </w:rPr>
-        <w:t xml:space="preserve">Open PowerShell and run:</w:t>
+        <w:t xml:space="preserve">Open PowerShell and paste:</w:t>
       </w:r>
     </w:p>
     <w:tbl>
@@ -1159,8 +1323,8 @@
               <w:rPr>
                 <w:rFonts w:ascii="Courier New" w:cs="Courier New" w:eastAsia="Courier New" w:hAnsi="Courier New"/>
                 <w:color w:val="86EFAC"/>
-                <w:sz w:val="20"/>
-                <w:szCs w:val="20"/>
+                <w:sz w:val="18"/>
+                <w:szCs w:val="18"/>
               </w:rPr>
               <w:t xml:space="preserve">irm https://raw.githubusercontent.com/NonAlex1/SEAssistPlugin/main/install.ps1 | iex</w:t>
             </w:r>
@@ -1168,6 +1332,138 @@
         </w:tc>
       </w:tr>
     </w:tbl>
+    <w:p>
+      <w:pPr>
+        <w:spacing w:after="0" w:before="120"/>
+      </w:pPr>
+      <w:r>
+        <w:rPr>
+          <w:rFonts w:ascii="Arial" w:cs="Arial" w:eastAsia="Arial" w:hAnsi="Arial"/>
+        </w:rPr>
+        <w:t xml:space="preserve"/>
+      </w:r>
+    </w:p>
+    <w:p>
+      <w:pPr>
+        <w:spacing w:after="80" w:before="0"/>
+      </w:pPr>
+      <w:r>
+        <w:rPr>
+          <w:rFonts w:ascii="Arial" w:cs="Arial" w:eastAsia="Arial" w:hAnsi="Arial"/>
+        </w:rPr>
+        <w:t xml:space="preserve">The installer performs these steps automatically:</w:t>
+      </w:r>
+    </w:p>
+    <w:p>
+      <w:pPr>
+        <w:pStyle w:val="ListParagraph"/>
+        <w:numPr>
+          <w:ilvl w:val="0"/>
+          <w:numId w:val="2"/>
+        </w:numPr>
+        <w:spacing w:after="40" w:before="40"/>
+      </w:pPr>
+      <w:r>
+        <w:rPr>
+          <w:rFonts w:ascii="Arial" w:cs="Arial" w:eastAsia="Arial" w:hAnsi="Arial"/>
+        </w:rPr>
+        <w:t xml:space="preserve">Installs Node.js via winget and Salesforce CLI via npm if not present</w:t>
+      </w:r>
+    </w:p>
+    <w:p>
+      <w:pPr>
+        <w:pStyle w:val="ListParagraph"/>
+        <w:numPr>
+          <w:ilvl w:val="0"/>
+          <w:numId w:val="2"/>
+        </w:numPr>
+        <w:spacing w:after="40" w:before="40"/>
+      </w:pPr>
+      <w:r>
+        <w:rPr>
+          <w:rFonts w:ascii="Arial" w:cs="Arial" w:eastAsia="Arial" w:hAnsi="Arial"/>
+        </w:rPr>
+        <w:t xml:space="preserve">Downloads the proxy server to %USERPROFILE%\.seassist\</w:t>
+      </w:r>
+    </w:p>
+    <w:p>
+      <w:pPr>
+        <w:pStyle w:val="ListParagraph"/>
+        <w:numPr>
+          <w:ilvl w:val="0"/>
+          <w:numId w:val="2"/>
+        </w:numPr>
+        <w:spacing w:after="40" w:before="40"/>
+      </w:pPr>
+      <w:r>
+        <w:rPr>
+          <w:rFonts w:ascii="Arial" w:cs="Arial" w:eastAsia="Arial" w:hAnsi="Arial"/>
+        </w:rPr>
+        <w:t xml:space="preserve">Downloads the PKI certificate and private key from the repository</w:t>
+      </w:r>
+    </w:p>
+    <w:p>
+      <w:pPr>
+        <w:pStyle w:val="ListParagraph"/>
+        <w:numPr>
+          <w:ilvl w:val="0"/>
+          <w:numId w:val="2"/>
+        </w:numPr>
+        <w:spacing w:after="40" w:before="40"/>
+      </w:pPr>
+      <w:r>
+        <w:rPr>
+          <w:rFonts w:ascii="Arial" w:cs="Arial" w:eastAsia="Arial" w:hAnsi="Arial"/>
+        </w:rPr>
+        <w:t xml:space="preserve">Checks if Extreme Networks CA certificates are trusted; </w:t>
+      </w:r>
+      <w:r>
+        <w:rPr>
+          <w:rFonts w:ascii="Arial" w:cs="Arial" w:eastAsia="Arial" w:hAnsi="Arial"/>
+          <w:b/>
+          <w:bCs/>
+        </w:rPr>
+        <w:t xml:space="preserve">installs them automatically</w:t>
+      </w:r>
+      <w:r>
+        <w:rPr>
+          <w:rFonts w:ascii="Arial" w:cs="Arial" w:eastAsia="Arial" w:hAnsi="Arial"/>
+        </w:rPr>
+        <w:t xml:space="preserve"> (Intermediate CA silently; Root CA shows a one-time Windows confirmation dialog — click Yes)</w:t>
+      </w:r>
+    </w:p>
+    <w:p>
+      <w:pPr>
+        <w:pStyle w:val="ListParagraph"/>
+        <w:numPr>
+          <w:ilvl w:val="0"/>
+          <w:numId w:val="2"/>
+        </w:numPr>
+        <w:spacing w:after="40" w:before="40"/>
+      </w:pPr>
+      <w:r>
+        <w:rPr>
+          <w:rFonts w:ascii="Arial" w:cs="Arial" w:eastAsia="Arial" w:hAnsi="Arial"/>
+        </w:rPr>
+        <w:t xml:space="preserve">Registers a Windows Task Scheduler job that starts the proxy at every login</w:t>
+      </w:r>
+    </w:p>
+    <w:p>
+      <w:pPr>
+        <w:pStyle w:val="ListParagraph"/>
+        <w:numPr>
+          <w:ilvl w:val="0"/>
+          <w:numId w:val="2"/>
+        </w:numPr>
+        <w:spacing w:after="40" w:before="40"/>
+      </w:pPr>
+      <w:r>
+        <w:rPr>
+          <w:rFonts w:ascii="Arial" w:cs="Arial" w:eastAsia="Arial" w:hAnsi="Arial"/>
+        </w:rPr>
+        <w:t xml:space="preserve">Downloads the Outlook manifest to your Downloads folder</w:t>
+      </w:r>
+    </w:p>
     <w:p>
       <w:pPr>
         <w:spacing w:after="0" w:before="120"/>
@@ -1227,7 +1523,7 @@
                 <w:rFonts w:ascii="Arial" w:cs="Arial" w:eastAsia="Arial" w:hAnsi="Arial"/>
                 <w:color w:val="1E3A5F"/>
               </w:rPr>
-              <w:t xml:space="preserve">Node.js is installed via winget; the Salesforce CLI is installed via npm. The proxy is registered as a Windows Task Scheduler job that starts automatically at login.</w:t>
+              <w:t xml:space="preserve">If PowerShell blocks the script with an execution policy error, the installer sets RemoteSigned policy for the current user automatically.</w:t>
             </w:r>
           </w:p>
         </w:tc>
@@ -1266,9 +1562,74 @@
         <w:rPr>
           <w:rFonts w:ascii="Arial" w:cs="Arial" w:eastAsia="Arial" w:hAnsi="Arial"/>
         </w:rPr>
-        <w:t xml:space="preserve">Follow the same options (A, B, or C) described in the macOS section above.</w:t>
-      </w:r>
-    </w:p>
+        <w:t xml:space="preserve">Follow the same options A, B, or C described in the macOS section above.</w:t>
+      </w:r>
+    </w:p>
+    <w:p>
+      <w:pPr>
+        <w:spacing w:after="0" w:before="80"/>
+      </w:pPr>
+      <w:r>
+        <w:rPr>
+          <w:rFonts w:ascii="Arial" w:cs="Arial" w:eastAsia="Arial" w:hAnsi="Arial"/>
+        </w:rPr>
+        <w:t xml:space="preserve"/>
+      </w:r>
+    </w:p>
+    <w:tbl>
+      <w:tblPr>
+        <w:tblW w:type="dxa" w:w="9360"/>
+        <w:tblBorders>
+          <w:top w:val="single" w:color="auto" w:sz="4"/>
+          <w:left w:val="single" w:color="auto" w:sz="4"/>
+          <w:bottom w:val="single" w:color="auto" w:sz="4"/>
+          <w:right w:val="single" w:color="auto" w:sz="4"/>
+          <w:insideH w:val="single" w:color="auto" w:sz="4"/>
+          <w:insideV w:val="single" w:color="auto" w:sz="4"/>
+        </w:tblBorders>
+      </w:tblPr>
+      <w:tblGrid>
+        <w:gridCol w:w="9360"/>
+      </w:tblGrid>
+      <w:tr>
+        <w:tc>
+          <w:tcPr>
+            <w:tcW w:type="dxa" w:w="9360"/>
+            <w:tcBorders>
+              <w:top w:val="nil" w:color="FFFFFF" w:sz="0"/>
+              <w:left w:val="nil" w:color="FFFFFF" w:sz="0"/>
+              <w:bottom w:val="nil" w:color="FFFFFF" w:sz="0"/>
+              <w:right w:val="nil" w:color="FFFFFF" w:sz="0"/>
+            </w:tcBorders>
+            <w:shd w:fill="FFF7ED" w:val="clear"/>
+            <w:tcMar>
+              <w:top w:type="dxa" w:w="120"/>
+              <w:left w:type="dxa" w:w="160"/>
+              <w:bottom w:type="dxa" w:w="120"/>
+              <w:right w:type="dxa" w:w="160"/>
+            </w:tcMar>
+          </w:tcPr>
+          <w:p>
+            <w:r>
+              <w:rPr>
+                <w:rFonts w:ascii="Arial" w:cs="Arial" w:eastAsia="Arial" w:hAnsi="Arial"/>
+                <w:b/>
+                <w:bCs/>
+                <w:color w:val="C2410C"/>
+              </w:rPr>
+              <w:t xml:space="preserve">Note: </w:t>
+            </w:r>
+            <w:r>
+              <w:rPr>
+                <w:rFonts w:ascii="Arial" w:cs="Arial" w:eastAsia="Arial" w:hAnsi="Arial"/>
+                <w:color w:val="7C2D12"/>
+              </w:rPr>
+              <w:t xml:space="preserve">"Installation takes longer than expected" warning: this is a cosmetic Outlook warning shown for all sideloaded custom add-ins regardless of speed. The add-in installs correctly — dismiss the dialog and it will appear in your ribbon.</w:t>
+            </w:r>
+          </w:p>
+        </w:tc>
+      </w:tr>
+    </w:tbl>
     <w:p>
       <w:r>
         <w:br w:type="page"/>
@@ -1302,7 +1663,7 @@
         <w:rPr>
           <w:rFonts w:ascii="Arial" w:cs="Arial" w:eastAsia="Arial" w:hAnsi="Arial"/>
         </w:rPr>
-        <w:t xml:space="preserve">The first time you open SE Assist, you will see a Sign In screen. Authentication uses the Salesforce CLI and your company's SSO — no password is stored locally.</w:t>
+        <w:t xml:space="preserve">The first time you open SE Assist, you will see a Sign In screen. Authentication uses the Salesforce CLI and your company’s SSO — no password is stored locally.</w:t>
       </w:r>
     </w:p>
     <w:tbl>
@@ -1882,7 +2243,7 @@
         <w:rPr>
           <w:rFonts w:ascii="Arial" w:cs="Arial" w:eastAsia="Arial" w:hAnsi="Arial"/>
         </w:rPr>
-        <w:t xml:space="preserve"> button in the ribbon (in the SE Assist group)</w:t>
+        <w:t xml:space="preserve"> button in the ribbon</w:t>
       </w:r>
     </w:p>
     <w:p>
@@ -2184,7 +2545,7 @@
                 <w:sz w:val="20"/>
                 <w:szCs w:val="20"/>
               </w:rPr>
-              <w:t xml:space="preserve">Looked up from participant email domains. Internal-only meetings pre-select Extreme Networks Corp</w:t>
+              <w:t xml:space="preserve">Looked up from participant email domains. Internal-only meetings (@extremenetworks.com only) automatically pre-select Extreme Networks Corp</w:t>
             </w:r>
           </w:p>
         </w:tc>
@@ -2243,7 +2604,7 @@
                 <w:sz w:val="20"/>
                 <w:szCs w:val="20"/>
               </w:rPr>
-              <w:t xml:space="preserve">Detected from keywords in the subject (Demo, PoC, Pitch, QBR, etc.)</w:t>
+              <w:t xml:space="preserve">Detected from keywords in the subject (Demo, PoC, Pitch, QBR, Training, etc.)</w:t>
             </w:r>
           </w:p>
         </w:tc>
@@ -2307,7 +2668,7 @@
         <w:rPr>
           <w:rFonts w:ascii="Arial" w:cs="Arial" w:eastAsia="Arial" w:hAnsi="Arial"/>
         </w:rPr>
-        <w:t xml:space="preserve">If an account was found automatically it appears pre-selected — you can accept it or clear it to search manually</w:t>
+        <w:t xml:space="preserve">If an account was found automatically it appears pre-selected — accept it or clear it to search manually</w:t>
       </w:r>
     </w:p>
     <w:p>
@@ -2337,7 +2698,7 @@
         <w:rPr>
           <w:rFonts w:ascii="Arial" w:cs="Arial" w:eastAsia="Arial" w:hAnsi="Arial"/>
         </w:rPr>
-        <w:t xml:space="preserve"> — results appear automatically after a short pause</w:t>
+        <w:t xml:space="preserve"> — results appear automatically after ~400ms, no button click needed</w:t>
       </w:r>
     </w:p>
     <w:p>
@@ -2358,34 +2719,6 @@
     </w:p>
     <w:p>
       <w:pPr>
-        <w:spacing w:after="0" w:before="80"/>
-      </w:pPr>
-      <w:r>
-        <w:rPr>
-          <w:rFonts w:ascii="Arial" w:cs="Arial" w:eastAsia="Arial" w:hAnsi="Arial"/>
-        </w:rPr>
-        <w:t xml:space="preserve"/>
-      </w:r>
-    </w:p>
-    <w:p>
-      <w:pPr>
-        <w:pStyle w:val="Heading3"/>
-        <w:spacing w:after="80" w:before="200"/>
-      </w:pPr>
-      <w:r>
-        <w:rPr>
-          <w:rFonts w:ascii="Arial" w:cs="Arial" w:eastAsia="Arial" w:hAnsi="Arial"/>
-          <w:b/>
-          <w:bCs/>
-          <w:color w:val="334155"/>
-          <w:sz w:val="24"/>
-          <w:szCs w:val="24"/>
-        </w:rPr>
-        <w:t xml:space="preserve">Opportunity</w:t>
-      </w:r>
-    </w:p>
-    <w:p>
-      <w:pPr>
         <w:pStyle w:val="ListParagraph"/>
         <w:numPr>
           <w:ilvl w:val="0"/>
@@ -2397,7 +2730,35 @@
         <w:rPr>
           <w:rFonts w:ascii="Arial" w:cs="Arial" w:eastAsia="Arial" w:hAnsi="Arial"/>
         </w:rPr>
-        <w:t xml:space="preserve">Appears after an account is selected</w:t>
+        <w:t xml:space="preserve">For internal meetings, Extreme Networks Corp is pre-selected automatically</w:t>
+      </w:r>
+    </w:p>
+    <w:p>
+      <w:pPr>
+        <w:spacing w:after="0" w:before="80"/>
+      </w:pPr>
+      <w:r>
+        <w:rPr>
+          <w:rFonts w:ascii="Arial" w:cs="Arial" w:eastAsia="Arial" w:hAnsi="Arial"/>
+        </w:rPr>
+        <w:t xml:space="preserve"/>
+      </w:r>
+    </w:p>
+    <w:p>
+      <w:pPr>
+        <w:pStyle w:val="Heading3"/>
+        <w:spacing w:after="80" w:before="200"/>
+      </w:pPr>
+      <w:r>
+        <w:rPr>
+          <w:rFonts w:ascii="Arial" w:cs="Arial" w:eastAsia="Arial" w:hAnsi="Arial"/>
+          <w:b/>
+          <w:bCs/>
+          <w:color w:val="334155"/>
+          <w:sz w:val="24"/>
+          <w:szCs w:val="24"/>
+        </w:rPr>
+        <w:t xml:space="preserve">Opportunity</w:t>
       </w:r>
     </w:p>
     <w:p>
@@ -2413,7 +2774,7 @@
         <w:rPr>
           <w:rFonts w:ascii="Arial" w:cs="Arial" w:eastAsia="Arial" w:hAnsi="Arial"/>
         </w:rPr>
-        <w:t xml:space="preserve">Lists open opportunities and recently closed opportunities (within the last year)</w:t>
+        <w:t xml:space="preserve">Appears after an account is selected</w:t>
       </w:r>
     </w:p>
     <w:p>
@@ -2429,7 +2790,7 @@
         <w:rPr>
           <w:rFonts w:ascii="Arial" w:cs="Arial" w:eastAsia="Arial" w:hAnsi="Arial"/>
         </w:rPr>
-        <w:t xml:space="preserve">Each entry shows the stage and deal amount</w:t>
+        <w:t xml:space="preserve">Lists open opportunities and recently closed opportunities (within the last year)</w:t>
       </w:r>
     </w:p>
     <w:p>
@@ -2445,35 +2806,7 @@
         <w:rPr>
           <w:rFonts w:ascii="Arial" w:cs="Arial" w:eastAsia="Arial" w:hAnsi="Arial"/>
         </w:rPr>
-        <w:t xml:space="preserve">Opportunity selection is optional</w:t>
-      </w:r>
-    </w:p>
-    <w:p>
-      <w:pPr>
-        <w:spacing w:after="0" w:before="80"/>
-      </w:pPr>
-      <w:r>
-        <w:rPr>
-          <w:rFonts w:ascii="Arial" w:cs="Arial" w:eastAsia="Arial" w:hAnsi="Arial"/>
-        </w:rPr>
-        <w:t xml:space="preserve"/>
-      </w:r>
-    </w:p>
-    <w:p>
-      <w:pPr>
-        <w:pStyle w:val="Heading3"/>
-        <w:spacing w:after="80" w:before="200"/>
-      </w:pPr>
-      <w:r>
-        <w:rPr>
-          <w:rFonts w:ascii="Arial" w:cs="Arial" w:eastAsia="Arial" w:hAnsi="Arial"/>
-          <w:b/>
-          <w:bCs/>
-          <w:color w:val="334155"/>
-          <w:sz w:val="24"/>
-          <w:szCs w:val="24"/>
-        </w:rPr>
-        <w:t xml:space="preserve">Activity Type</w:t>
+        <w:t xml:space="preserve">Each entry shows: Name · Stage · Amount</w:t>
       </w:r>
     </w:p>
     <w:p>
@@ -2489,7 +2822,35 @@
         <w:rPr>
           <w:rFonts w:ascii="Arial" w:cs="Arial" w:eastAsia="Arial" w:hAnsi="Arial"/>
         </w:rPr>
-        <w:t xml:space="preserve">One or more values detected from the subject line are pre-checked</w:t>
+        <w:t xml:space="preserve">Opportunity selection is optional</w:t>
+      </w:r>
+    </w:p>
+    <w:p>
+      <w:pPr>
+        <w:spacing w:after="0" w:before="80"/>
+      </w:pPr>
+      <w:r>
+        <w:rPr>
+          <w:rFonts w:ascii="Arial" w:cs="Arial" w:eastAsia="Arial" w:hAnsi="Arial"/>
+        </w:rPr>
+        <w:t xml:space="preserve"/>
+      </w:r>
+    </w:p>
+    <w:p>
+      <w:pPr>
+        <w:pStyle w:val="Heading3"/>
+        <w:spacing w:after="80" w:before="200"/>
+      </w:pPr>
+      <w:r>
+        <w:rPr>
+          <w:rFonts w:ascii="Arial" w:cs="Arial" w:eastAsia="Arial" w:hAnsi="Arial"/>
+          <w:b/>
+          <w:bCs/>
+          <w:color w:val="334155"/>
+          <w:sz w:val="24"/>
+          <w:szCs w:val="24"/>
+        </w:rPr>
+        <w:t xml:space="preserve">Activity Type</w:t>
       </w:r>
     </w:p>
     <w:p>
@@ -2505,35 +2866,7 @@
         <w:rPr>
           <w:rFonts w:ascii="Arial" w:cs="Arial" w:eastAsia="Arial" w:hAnsi="Arial"/>
         </w:rPr>
-        <w:t xml:space="preserve">Add or remove values using the multi-select checkboxes</w:t>
-      </w:r>
-    </w:p>
-    <w:p>
-      <w:pPr>
-        <w:spacing w:after="0" w:before="80"/>
-      </w:pPr>
-      <w:r>
-        <w:rPr>
-          <w:rFonts w:ascii="Arial" w:cs="Arial" w:eastAsia="Arial" w:hAnsi="Arial"/>
-        </w:rPr>
-        <w:t xml:space="preserve"/>
-      </w:r>
-    </w:p>
-    <w:p>
-      <w:pPr>
-        <w:pStyle w:val="Heading3"/>
-        <w:spacing w:after="80" w:before="200"/>
-      </w:pPr>
-      <w:r>
-        <w:rPr>
-          <w:rFonts w:ascii="Arial" w:cs="Arial" w:eastAsia="Arial" w:hAnsi="Arial"/>
-          <w:b/>
-          <w:bCs/>
-          <w:color w:val="334155"/>
-          <w:sz w:val="24"/>
-          <w:szCs w:val="24"/>
-        </w:rPr>
-        <w:t xml:space="preserve">Proposed Extreme Solution(s)</w:t>
+        <w:t xml:space="preserve">One or more values detected from the subject line are pre-checked</w:t>
       </w:r>
     </w:p>
     <w:p>
@@ -2548,16 +2881,8 @@
       <w:r>
         <w:rPr>
           <w:rFonts w:ascii="Arial" w:cs="Arial" w:eastAsia="Arial" w:hAnsi="Arial"/>
-          <w:b/>
-          <w:bCs/>
-        </w:rPr>
-        <w:t xml:space="preserve">Required. </w:t>
-      </w:r>
-      <w:r>
-        <w:rPr>
-          <w:rFonts w:ascii="Arial" w:cs="Arial" w:eastAsia="Arial" w:hAnsi="Arial"/>
-        </w:rPr>
-        <w:t xml:space="preserve">Select all Extreme products or solutions discussed in this activity</w:t>
+        </w:rPr>
+        <w:t xml:space="preserve">Add or remove values using the multi-select checkboxes</w:t>
       </w:r>
     </w:p>
     <w:p>
@@ -2585,7 +2910,7 @@
           <w:sz w:val="24"/>
           <w:szCs w:val="24"/>
         </w:rPr>
-        <w:t xml:space="preserve">Activity Status</w:t>
+        <w:t xml:space="preserve">Proposed Extreme Solution(s)</w:t>
       </w:r>
     </w:p>
     <w:p>
@@ -2600,8 +2925,44 @@
       <w:r>
         <w:rPr>
           <w:rFonts w:ascii="Arial" w:cs="Arial" w:eastAsia="Arial" w:hAnsi="Arial"/>
-        </w:rPr>
-        <w:t xml:space="preserve">Defaults to Completed</w:t>
+          <w:b/>
+          <w:bCs/>
+        </w:rPr>
+        <w:t xml:space="preserve">Required. </w:t>
+      </w:r>
+      <w:r>
+        <w:rPr>
+          <w:rFonts w:ascii="Arial" w:cs="Arial" w:eastAsia="Arial" w:hAnsi="Arial"/>
+        </w:rPr>
+        <w:t xml:space="preserve">Select all Extreme products or solutions discussed in this activity</w:t>
+      </w:r>
+    </w:p>
+    <w:p>
+      <w:pPr>
+        <w:spacing w:after="0" w:before="80"/>
+      </w:pPr>
+      <w:r>
+        <w:rPr>
+          <w:rFonts w:ascii="Arial" w:cs="Arial" w:eastAsia="Arial" w:hAnsi="Arial"/>
+        </w:rPr>
+        <w:t xml:space="preserve"/>
+      </w:r>
+    </w:p>
+    <w:p>
+      <w:pPr>
+        <w:pStyle w:val="Heading3"/>
+        <w:spacing w:after="80" w:before="200"/>
+      </w:pPr>
+      <w:r>
+        <w:rPr>
+          <w:rFonts w:ascii="Arial" w:cs="Arial" w:eastAsia="Arial" w:hAnsi="Arial"/>
+          <w:b/>
+          <w:bCs/>
+          <w:color w:val="334155"/>
+          <w:sz w:val="24"/>
+          <w:szCs w:val="24"/>
+        </w:rPr>
+        <w:t xml:space="preserve">Activity Status</w:t>
       </w:r>
     </w:p>
     <w:p>
@@ -2617,35 +2978,7 @@
         <w:rPr>
           <w:rFonts w:ascii="Arial" w:cs="Arial" w:eastAsia="Arial" w:hAnsi="Arial"/>
         </w:rPr>
-        <w:t xml:space="preserve">Change to Planned, Cancelled, etc. if appropriate</w:t>
-      </w:r>
-    </w:p>
-    <w:p>
-      <w:pPr>
-        <w:spacing w:after="0" w:before="80"/>
-      </w:pPr>
-      <w:r>
-        <w:rPr>
-          <w:rFonts w:ascii="Arial" w:cs="Arial" w:eastAsia="Arial" w:hAnsi="Arial"/>
-        </w:rPr>
-        <w:t xml:space="preserve"/>
-      </w:r>
-    </w:p>
-    <w:p>
-      <w:pPr>
-        <w:pStyle w:val="Heading3"/>
-        <w:spacing w:after="80" w:before="200"/>
-      </w:pPr>
-      <w:r>
-        <w:rPr>
-          <w:rFonts w:ascii="Arial" w:cs="Arial" w:eastAsia="Arial" w:hAnsi="Arial"/>
-          <w:b/>
-          <w:bCs/>
-          <w:color w:val="334155"/>
-          <w:sz w:val="24"/>
-          <w:szCs w:val="24"/>
-        </w:rPr>
-        <w:t xml:space="preserve">Details</w:t>
+        <w:t xml:space="preserve">Defaults to Completed</w:t>
       </w:r>
     </w:p>
     <w:p>
@@ -2661,7 +2994,35 @@
         <w:rPr>
           <w:rFonts w:ascii="Arial" w:cs="Arial" w:eastAsia="Arial" w:hAnsi="Arial"/>
         </w:rPr>
-        <w:t xml:space="preserve">Free-text field for notes, context, or follow-up items</w:t>
+        <w:t xml:space="preserve">Change to Planned, Cancelled, No Show, etc. if appropriate</w:t>
+      </w:r>
+    </w:p>
+    <w:p>
+      <w:pPr>
+        <w:spacing w:after="0" w:before="80"/>
+      </w:pPr>
+      <w:r>
+        <w:rPr>
+          <w:rFonts w:ascii="Arial" w:cs="Arial" w:eastAsia="Arial" w:hAnsi="Arial"/>
+        </w:rPr>
+        <w:t xml:space="preserve"/>
+      </w:r>
+    </w:p>
+    <w:p>
+      <w:pPr>
+        <w:pStyle w:val="Heading3"/>
+        <w:spacing w:after="80" w:before="200"/>
+      </w:pPr>
+      <w:r>
+        <w:rPr>
+          <w:rFonts w:ascii="Arial" w:cs="Arial" w:eastAsia="Arial" w:hAnsi="Arial"/>
+          <w:b/>
+          <w:bCs/>
+          <w:color w:val="334155"/>
+          <w:sz w:val="24"/>
+          <w:szCs w:val="24"/>
+        </w:rPr>
+        <w:t xml:space="preserve">Details</w:t>
       </w:r>
     </w:p>
     <w:p>
@@ -2677,7 +3038,7 @@
         <w:rPr>
           <w:rFonts w:ascii="Arial" w:cs="Arial" w:eastAsia="Arial" w:hAnsi="Arial"/>
         </w:rPr>
-        <w:t xml:space="preserve">Pre-filled with the email/event type as a starting point</w:t>
+        <w:t xml:space="preserve">Free-text field for notes, context, or follow-up items</w:t>
       </w:r>
     </w:p>
     <w:p>
@@ -2737,7 +3098,7 @@
         <w:rPr>
           <w:rFonts w:ascii="Arial" w:cs="Arial" w:eastAsia="Arial" w:hAnsi="Arial"/>
         </w:rPr>
-        <w:t xml:space="preserve">Click the </w:t>
+        <w:t xml:space="preserve">Click </w:t>
       </w:r>
       <w:r>
         <w:rPr>
@@ -2751,7 +3112,7 @@
         <w:rPr>
           <w:rFonts w:ascii="Arial" w:cs="Arial" w:eastAsia="Arial" w:hAnsi="Arial"/>
         </w:rPr>
-        <w:t xml:space="preserve"> button at the bottom of the form</w:t>
+        <w:t xml:space="preserve"> at the bottom of the form</w:t>
       </w:r>
     </w:p>
     <w:p>
@@ -2829,7 +3190,8 @@
                 <w:rFonts w:ascii="Arial" w:cs="Arial" w:eastAsia="Arial" w:hAnsi="Arial"/>
                 <w:color w:val="1E3A5F"/>
               </w:rPr>
-              <w:t xml:space="preserve">If the proxy server is not reachable, start it by running: node ~/.seassist/server.js in a terminal window. On Mac it starts automatically at login; on Windows it runs as a scheduled task.</w:t>
+              <w:t xml:space="preserve">If the proxy server is not reachable: on Mac, open Terminal and run: launchctl bootstrap gui/$(id -u) ~/Library/LaunchAgents/com.extreme.seassist.plist
+On Windows, open Task Scheduler and start the "SE Assist Proxy" task manually.</w:t>
             </w:r>
           </w:p>
         </w:tc>
@@ -3684,8 +4046,8 @@
         </w:tblBorders>
       </w:tblPr>
       <w:tblGrid>
-        <w:gridCol w:w="3600"/>
-        <w:gridCol w:w="5760"/>
+        <w:gridCol w:w="3400"/>
+        <w:gridCol w:w="5960"/>
       </w:tblGrid>
       <w:tr>
         <w:trPr>
@@ -3693,7 +4055,7 @@
         </w:trPr>
         <w:tc>
           <w:tcPr>
-            <w:tcW w:type="dxa" w:w="3600"/>
+            <w:tcW w:type="dxa" w:w="3400"/>
             <w:tcBorders>
               <w:top w:val="single" w:color="E2E8F0" w:sz="1"/>
               <w:left w:val="single" w:color="E2E8F0" w:sz="1"/>
@@ -3724,7 +4086,7 @@
         </w:tc>
         <w:tc>
           <w:tcPr>
-            <w:tcW w:type="dxa" w:w="5760"/>
+            <w:tcW w:type="dxa" w:w="5960"/>
             <w:tcBorders>
               <w:top w:val="single" w:color="E2E8F0" w:sz="1"/>
               <w:left w:val="single" w:color="E2E8F0" w:sz="1"/>
@@ -3757,7 +4119,7 @@
       <w:tr>
         <w:tc>
           <w:tcPr>
-            <w:tcW w:type="dxa" w:w="3600"/>
+            <w:tcW w:type="dxa" w:w="3400"/>
             <w:tcBorders>
               <w:top w:val="single" w:color="E2E8F0" w:sz="1"/>
               <w:left w:val="single" w:color="E2E8F0" w:sz="1"/>
@@ -3787,13 +4149,14 @@
         </w:tc>
         <w:tc>
           <w:tcPr>
-            <w:tcW w:type="dxa" w:w="5760"/>
+            <w:tcW w:type="dxa" w:w="5960"/>
             <w:tcBorders>
               <w:top w:val="single" w:color="E2E8F0" w:sz="1"/>
               <w:left w:val="single" w:color="E2E8F0" w:sz="1"/>
               <w:bottom w:val="single" w:color="E2E8F0" w:sz="1"/>
               <w:right w:val="single" w:color="E2E8F0" w:sz="1"/>
             </w:tcBorders>
+            <w:shd w:fill="FFFFFF" w:val="clear"/>
             <w:tcMar>
               <w:top w:type="dxa" w:w="80"/>
               <w:left w:type="dxa" w:w="120"/>
@@ -3808,17 +4171,37 @@
                 <w:sz w:val="20"/>
                 <w:szCs w:val="20"/>
               </w:rPr>
-              <w:t xml:space="preserve">Mac: check Activity Monitor for "node" process. If absent, run: launchctl load ~/Library/LaunchAgents/com.extreme.seassist.plist</w:t>
-            </w:r>
-          </w:p>
-          <w:p>
-            <w:r>
-              <w:rPr>
-                <w:rFonts w:ascii="Arial" w:cs="Arial" w:eastAsia="Arial" w:hAnsi="Arial"/>
-                <w:sz w:val="20"/>
-                <w:szCs w:val="20"/>
-              </w:rPr>
-              <w:t xml:space="preserve">Windows: open Task Scheduler and run the "SE Assist Proxy" task manually.</w:t>
+              <w:t xml:space="preserve">Mac: run in Terminal:</w:t>
+            </w:r>
+          </w:p>
+          <w:p>
+            <w:r>
+              <w:rPr>
+                <w:rFonts w:ascii="Arial" w:cs="Arial" w:eastAsia="Arial" w:hAnsi="Arial"/>
+                <w:sz w:val="20"/>
+                <w:szCs w:val="20"/>
+              </w:rPr>
+              <w:t xml:space="preserve">launchctl bootstrap gui/$(id -u) ~/Library/LaunchAgents/com.extreme.seassist.plist</w:t>
+            </w:r>
+          </w:p>
+          <w:p>
+            <w:r>
+              <w:rPr>
+                <w:rFonts w:ascii="Arial" w:cs="Arial" w:eastAsia="Arial" w:hAnsi="Arial"/>
+                <w:sz w:val="20"/>
+                <w:szCs w:val="20"/>
+              </w:rPr>
+              <w:t xml:space="preserve"/>
+            </w:r>
+          </w:p>
+          <w:p>
+            <w:r>
+              <w:rPr>
+                <w:rFonts w:ascii="Arial" w:cs="Arial" w:eastAsia="Arial" w:hAnsi="Arial"/>
+                <w:sz w:val="20"/>
+                <w:szCs w:val="20"/>
+              </w:rPr>
+              <w:t xml:space="preserve">Windows: open Task Scheduler → find "SE Assist Proxy" → Run.</w:t>
             </w:r>
           </w:p>
         </w:tc>
@@ -3826,14 +4209,14 @@
       <w:tr>
         <w:tc>
           <w:tcPr>
-            <w:tcW w:type="dxa" w:w="3600"/>
+            <w:tcW w:type="dxa" w:w="3400"/>
             <w:tcBorders>
               <w:top w:val="single" w:color="E2E8F0" w:sz="1"/>
               <w:left w:val="single" w:color="E2E8F0" w:sz="1"/>
               <w:bottom w:val="single" w:color="E2E8F0" w:sz="1"/>
               <w:right w:val="single" w:color="E2E8F0" w:sz="1"/>
             </w:tcBorders>
-            <w:shd w:fill="F1F5F9" w:val="clear"/>
+            <w:shd w:fill="FFFFFF" w:val="clear"/>
             <w:tcMar>
               <w:top w:type="dxa" w:w="80"/>
               <w:left w:type="dxa" w:w="120"/>
@@ -3850,19 +4233,20 @@
                 <w:sz w:val="20"/>
                 <w:szCs w:val="20"/>
               </w:rPr>
-              <w:t xml:space="preserve">Sign-in button reappears after login</w:t>
-            </w:r>
-          </w:p>
-        </w:tc>
-        <w:tc>
-          <w:tcPr>
-            <w:tcW w:type="dxa" w:w="5760"/>
+              <w:t xml:space="preserve">"Installation takes longer than expected" in Outlook</w:t>
+            </w:r>
+          </w:p>
+        </w:tc>
+        <w:tc>
+          <w:tcPr>
+            <w:tcW w:type="dxa" w:w="5960"/>
             <w:tcBorders>
               <w:top w:val="single" w:color="E2E8F0" w:sz="1"/>
               <w:left w:val="single" w:color="E2E8F0" w:sz="1"/>
               <w:bottom w:val="single" w:color="E2E8F0" w:sz="1"/>
               <w:right w:val="single" w:color="E2E8F0" w:sz="1"/>
             </w:tcBorders>
+            <w:shd w:fill="FFFFFF" w:val="clear"/>
             <w:tcMar>
               <w:top w:type="dxa" w:w="80"/>
               <w:left w:type="dxa" w:w="120"/>
@@ -3877,7 +4261,7 @@
                 <w:sz w:val="20"/>
                 <w:szCs w:val="20"/>
               </w:rPr>
-              <w:t xml:space="preserve">Wait up to 30 seconds for the add-in to detect the completed login. If it persists, click Sign in again — the browser tab may not have completed the OAuth flow.</w:t>
+              <w:t xml:space="preserve">Cosmetic warning shown for all sideloaded add-ins — not an error. Dismiss the dialog; the add-in installs and works correctly.</w:t>
             </w:r>
           </w:p>
         </w:tc>
@@ -3885,7 +4269,7 @@
       <w:tr>
         <w:tc>
           <w:tcPr>
-            <w:tcW w:type="dxa" w:w="3600"/>
+            <w:tcW w:type="dxa" w:w="3400"/>
             <w:tcBorders>
               <w:top w:val="single" w:color="E2E8F0" w:sz="1"/>
               <w:left w:val="single" w:color="E2E8F0" w:sz="1"/>
@@ -3909,19 +4293,20 @@
                 <w:sz w:val="20"/>
                 <w:szCs w:val="20"/>
               </w:rPr>
-              <w:t xml:space="preserve">Account search returns no results</w:t>
-            </w:r>
-          </w:p>
-        </w:tc>
-        <w:tc>
-          <w:tcPr>
-            <w:tcW w:type="dxa" w:w="5760"/>
+              <w:t xml:space="preserve">Sign-in button reappears after login</w:t>
+            </w:r>
+          </w:p>
+        </w:tc>
+        <w:tc>
+          <w:tcPr>
+            <w:tcW w:type="dxa" w:w="5960"/>
             <w:tcBorders>
               <w:top w:val="single" w:color="E2E8F0" w:sz="1"/>
               <w:left w:val="single" w:color="E2E8F0" w:sz="1"/>
               <w:bottom w:val="single" w:color="E2E8F0" w:sz="1"/>
               <w:right w:val="single" w:color="E2E8F0" w:sz="1"/>
             </w:tcBorders>
+            <w:shd w:fill="FFFFFF" w:val="clear"/>
             <w:tcMar>
               <w:top w:type="dxa" w:w="80"/>
               <w:left w:type="dxa" w:w="120"/>
@@ -3936,7 +4321,7 @@
                 <w:sz w:val="20"/>
                 <w:szCs w:val="20"/>
               </w:rPr>
-              <w:t xml:space="preserve">Check that you have typed at least 5 characters. Results appear automatically after ~400ms. If still empty, the account may not exist in Salesforce or the proxy may be offline.</w:t>
+              <w:t xml:space="preserve">Wait up to 30 seconds for the add-in to detect the completed login. If it persists, click Sign in again.</w:t>
             </w:r>
           </w:p>
         </w:tc>
@@ -3944,14 +4329,14 @@
       <w:tr>
         <w:tc>
           <w:tcPr>
-            <w:tcW w:type="dxa" w:w="3600"/>
+            <w:tcW w:type="dxa" w:w="3400"/>
             <w:tcBorders>
               <w:top w:val="single" w:color="E2E8F0" w:sz="1"/>
               <w:left w:val="single" w:color="E2E8F0" w:sz="1"/>
               <w:bottom w:val="single" w:color="E2E8F0" w:sz="1"/>
               <w:right w:val="single" w:color="E2E8F0" w:sz="1"/>
             </w:tcBorders>
-            <w:shd w:fill="F1F5F9" w:val="clear"/>
+            <w:shd w:fill="FFFFFF" w:val="clear"/>
             <w:tcMar>
               <w:top w:type="dxa" w:w="80"/>
               <w:left w:type="dxa" w:w="120"/>
@@ -3968,19 +4353,20 @@
                 <w:sz w:val="20"/>
                 <w:szCs w:val="20"/>
               </w:rPr>
-              <w:t xml:space="preserve">Create button does nothing / error shown</w:t>
-            </w:r>
-          </w:p>
-        </w:tc>
-        <w:tc>
-          <w:tcPr>
-            <w:tcW w:type="dxa" w:w="5760"/>
+              <w:t xml:space="preserve">Account search returns no results</w:t>
+            </w:r>
+          </w:p>
+        </w:tc>
+        <w:tc>
+          <w:tcPr>
+            <w:tcW w:type="dxa" w:w="5960"/>
             <w:tcBorders>
               <w:top w:val="single" w:color="E2E8F0" w:sz="1"/>
               <w:left w:val="single" w:color="E2E8F0" w:sz="1"/>
               <w:bottom w:val="single" w:color="E2E8F0" w:sz="1"/>
               <w:right w:val="single" w:color="E2E8F0" w:sz="1"/>
             </w:tcBorders>
+            <w:shd w:fill="FFFFFF" w:val="clear"/>
             <w:tcMar>
               <w:top w:type="dxa" w:w="80"/>
               <w:left w:type="dxa" w:w="120"/>
@@ -3995,7 +4381,7 @@
                 <w:sz w:val="20"/>
                 <w:szCs w:val="20"/>
               </w:rPr>
-              <w:t xml:space="preserve">"Proposed Extreme Solution(s)" is a required field. Make sure at least one value is selected. Check the error message shown below the form for details.</w:t>
+              <w:t xml:space="preserve">Ensure you have typed at least 5 characters. Results appear automatically after ~400ms. If still empty, the proxy may be offline or the account may not exist in Salesforce.</w:t>
             </w:r>
           </w:p>
         </w:tc>
@@ -4003,7 +4389,7 @@
       <w:tr>
         <w:tc>
           <w:tcPr>
-            <w:tcW w:type="dxa" w:w="3600"/>
+            <w:tcW w:type="dxa" w:w="3400"/>
             <w:tcBorders>
               <w:top w:val="single" w:color="E2E8F0" w:sz="1"/>
               <w:left w:val="single" w:color="E2E8F0" w:sz="1"/>
@@ -4027,19 +4413,20 @@
                 <w:sz w:val="20"/>
                 <w:szCs w:val="20"/>
               </w:rPr>
-              <w:t xml:space="preserve">Add-in not visible in ribbon</w:t>
-            </w:r>
-          </w:p>
-        </w:tc>
-        <w:tc>
-          <w:tcPr>
-            <w:tcW w:type="dxa" w:w="5760"/>
+              <w:t xml:space="preserve">Create button does nothing / error shown</w:t>
+            </w:r>
+          </w:p>
+        </w:tc>
+        <w:tc>
+          <w:tcPr>
+            <w:tcW w:type="dxa" w:w="5960"/>
             <w:tcBorders>
               <w:top w:val="single" w:color="E2E8F0" w:sz="1"/>
               <w:left w:val="single" w:color="E2E8F0" w:sz="1"/>
               <w:bottom w:val="single" w:color="E2E8F0" w:sz="1"/>
               <w:right w:val="single" w:color="E2E8F0" w:sz="1"/>
             </w:tcBorders>
+            <w:shd w:fill="FFFFFF" w:val="clear"/>
             <w:tcMar>
               <w:top w:type="dxa" w:w="80"/>
               <w:left w:type="dxa" w:w="120"/>
@@ -4054,7 +4441,7 @@
                 <w:sz w:val="20"/>
                 <w:szCs w:val="20"/>
               </w:rPr>
-              <w:t xml:space="preserve">Confirm the add-in is listed under Get Add-ins → My Add-ins. If not, re-add using the manifest URL or file. Restart Outlook if needed.</w:t>
+              <w:t xml:space="preserve">"Proposed Extreme Solution(s)" is required — ensure at least one value is selected. Check the error message below the form for details.</w:t>
             </w:r>
           </w:p>
         </w:tc>
@@ -4062,14 +4449,14 @@
       <w:tr>
         <w:tc>
           <w:tcPr>
-            <w:tcW w:type="dxa" w:w="3600"/>
+            <w:tcW w:type="dxa" w:w="3400"/>
             <w:tcBorders>
               <w:top w:val="single" w:color="E2E8F0" w:sz="1"/>
               <w:left w:val="single" w:color="E2E8F0" w:sz="1"/>
               <w:bottom w:val="single" w:color="E2E8F0" w:sz="1"/>
               <w:right w:val="single" w:color="E2E8F0" w:sz="1"/>
             </w:tcBorders>
-            <w:shd w:fill="F1F5F9" w:val="clear"/>
+            <w:shd w:fill="FFFFFF" w:val="clear"/>
             <w:tcMar>
               <w:top w:type="dxa" w:w="80"/>
               <w:left w:type="dxa" w:w="120"/>
@@ -4086,19 +4473,20 @@
                 <w:sz w:val="20"/>
                 <w:szCs w:val="20"/>
               </w:rPr>
-              <w:t xml:space="preserve">Session expired error</w:t>
-            </w:r>
-          </w:p>
-        </w:tc>
-        <w:tc>
-          <w:tcPr>
-            <w:tcW w:type="dxa" w:w="5760"/>
+              <w:t xml:space="preserve">Add-in not visible in ribbon</w:t>
+            </w:r>
+          </w:p>
+        </w:tc>
+        <w:tc>
+          <w:tcPr>
+            <w:tcW w:type="dxa" w:w="5960"/>
             <w:tcBorders>
               <w:top w:val="single" w:color="E2E8F0" w:sz="1"/>
               <w:left w:val="single" w:color="E2E8F0" w:sz="1"/>
               <w:bottom w:val="single" w:color="E2E8F0" w:sz="1"/>
               <w:right w:val="single" w:color="E2E8F0" w:sz="1"/>
             </w:tcBorders>
+            <w:shd w:fill="FFFFFF" w:val="clear"/>
             <w:tcMar>
               <w:top w:type="dxa" w:w="80"/>
               <w:left w:type="dxa" w:w="120"/>
@@ -4113,21 +4501,135 @@
                 <w:sz w:val="20"/>
                 <w:szCs w:val="20"/>
               </w:rPr>
-              <w:t xml:space="preserve">Click the Sign in button that appears to re-authenticate. Sessions typically last 24 hours.</w:t>
+              <w:t xml:space="preserve">Confirm the add-in is listed under Get Add-ins → My Add-ins. If not, re-add using the manifest URL or file. Restart Outlook if needed.</w:t>
+            </w:r>
+          </w:p>
+        </w:tc>
+      </w:tr>
+      <w:tr>
+        <w:tc>
+          <w:tcPr>
+            <w:tcW w:type="dxa" w:w="3400"/>
+            <w:tcBorders>
+              <w:top w:val="single" w:color="E2E8F0" w:sz="1"/>
+              <w:left w:val="single" w:color="E2E8F0" w:sz="1"/>
+              <w:bottom w:val="single" w:color="E2E8F0" w:sz="1"/>
+              <w:right w:val="single" w:color="E2E8F0" w:sz="1"/>
+            </w:tcBorders>
+            <w:shd w:fill="F1F5F9" w:val="clear"/>
+            <w:tcMar>
+              <w:top w:type="dxa" w:w="80"/>
+              <w:left w:type="dxa" w:w="120"/>
+              <w:bottom w:type="dxa" w:w="80"/>
+              <w:right w:type="dxa" w:w="120"/>
+            </w:tcMar>
+          </w:tcPr>
+          <w:p>
+            <w:r>
+              <w:rPr>
+                <w:rFonts w:ascii="Arial" w:cs="Arial" w:eastAsia="Arial" w:hAnsi="Arial"/>
+                <w:b/>
+                <w:bCs/>
+                <w:sz w:val="20"/>
+                <w:szCs w:val="20"/>
+              </w:rPr>
+              <w:t xml:space="preserve">Session expired error</w:t>
+            </w:r>
+          </w:p>
+        </w:tc>
+        <w:tc>
+          <w:tcPr>
+            <w:tcW w:type="dxa" w:w="5960"/>
+            <w:tcBorders>
+              <w:top w:val="single" w:color="E2E8F0" w:sz="1"/>
+              <w:left w:val="single" w:color="E2E8F0" w:sz="1"/>
+              <w:bottom w:val="single" w:color="E2E8F0" w:sz="1"/>
+              <w:right w:val="single" w:color="E2E8F0" w:sz="1"/>
+            </w:tcBorders>
+            <w:shd w:fill="FFFFFF" w:val="clear"/>
+            <w:tcMar>
+              <w:top w:type="dxa" w:w="80"/>
+              <w:left w:type="dxa" w:w="120"/>
+              <w:bottom w:type="dxa" w:w="80"/>
+              <w:right w:type="dxa" w:w="120"/>
+            </w:tcMar>
+          </w:tcPr>
+          <w:p>
+            <w:r>
+              <w:rPr>
+                <w:rFonts w:ascii="Arial" w:cs="Arial" w:eastAsia="Arial" w:hAnsi="Arial"/>
+                <w:sz w:val="20"/>
+                <w:szCs w:val="20"/>
+              </w:rPr>
+              <w:t xml:space="preserve">Click the Sign in button to re-authenticate. Sessions typically last 24 hours.</w:t>
+            </w:r>
+          </w:p>
+        </w:tc>
+      </w:tr>
+      <w:tr>
+        <w:tc>
+          <w:tcPr>
+            <w:tcW w:type="dxa" w:w="3400"/>
+            <w:tcBorders>
+              <w:top w:val="single" w:color="E2E8F0" w:sz="1"/>
+              <w:left w:val="single" w:color="E2E8F0" w:sz="1"/>
+              <w:bottom w:val="single" w:color="E2E8F0" w:sz="1"/>
+              <w:right w:val="single" w:color="E2E8F0" w:sz="1"/>
+            </w:tcBorders>
+            <w:shd w:fill="FFFFFF" w:val="clear"/>
+            <w:tcMar>
+              <w:top w:type="dxa" w:w="80"/>
+              <w:left w:type="dxa" w:w="120"/>
+              <w:bottom w:type="dxa" w:w="80"/>
+              <w:right w:type="dxa" w:w="120"/>
+            </w:tcMar>
+          </w:tcPr>
+          <w:p>
+            <w:r>
+              <w:rPr>
+                <w:rFonts w:ascii="Arial" w:cs="Arial" w:eastAsia="Arial" w:hAnsi="Arial"/>
+                <w:b/>
+                <w:bCs/>
+                <w:sz w:val="20"/>
+                <w:szCs w:val="20"/>
+              </w:rPr>
+              <w:t xml:space="preserve">Certificate error in browser or Outlook</w:t>
+            </w:r>
+          </w:p>
+        </w:tc>
+        <w:tc>
+          <w:tcPr>
+            <w:tcW w:type="dxa" w:w="5960"/>
+            <w:tcBorders>
+              <w:top w:val="single" w:color="E2E8F0" w:sz="1"/>
+              <w:left w:val="single" w:color="E2E8F0" w:sz="1"/>
+              <w:bottom w:val="single" w:color="E2E8F0" w:sz="1"/>
+              <w:right w:val="single" w:color="E2E8F0" w:sz="1"/>
+            </w:tcBorders>
+            <w:shd w:fill="FFFFFF" w:val="clear"/>
+            <w:tcMar>
+              <w:top w:type="dxa" w:w="80"/>
+              <w:left w:type="dxa" w:w="120"/>
+              <w:bottom w:type="dxa" w:w="80"/>
+              <w:right w:type="dxa" w:w="120"/>
+            </w:tcMar>
+          </w:tcPr>
+          <w:p>
+            <w:r>
+              <w:rPr>
+                <w:rFonts w:ascii="Arial" w:cs="Arial" w:eastAsia="Arial" w:hAnsi="Arial"/>
+                <w:sz w:val="20"/>
+                <w:szCs w:val="20"/>
+              </w:rPr>
+              <w:t xml:space="preserve">Extreme Networks CA certificates may not be trusted. Re-run the installer — it detects and installs missing CA certificates automatically.</w:t>
             </w:r>
           </w:p>
         </w:tc>
       </w:tr>
     </w:tbl>
     <w:p>
-      <w:pPr>
-        <w:spacing w:after="0" w:before="200"/>
-      </w:pPr>
-      <w:r>
-        <w:rPr>
-          <w:rFonts w:ascii="Arial" w:cs="Arial" w:eastAsia="Arial" w:hAnsi="Arial"/>
-        </w:rPr>
-        <w:t xml:space="preserve"/>
+      <w:r>
+        <w:br w:type="page"/>
       </w:r>
     </w:p>
     <w:p>
@@ -4226,9 +4728,9 @@
             </w:tcBorders>
             <w:shd w:fill="1E293B" w:val="clear"/>
             <w:tcMar>
-              <w:top w:type="dxa" w:w="100"/>
+              <w:top w:type="dxa" w:w="120"/>
               <w:left w:type="dxa" w:w="200"/>
-              <w:bottom w:type="dxa" w:w="100"/>
+              <w:bottom w:type="dxa" w:w="120"/>
               <w:right w:type="dxa" w:w="200"/>
             </w:tcMar>
           </w:tcPr>
@@ -4237,8 +4739,8 @@
               <w:rPr>
                 <w:rFonts w:ascii="Courier New" w:cs="Courier New" w:eastAsia="Courier New" w:hAnsi="Courier New"/>
                 <w:color w:val="86EFAC"/>
-                <w:sz w:val="20"/>
-                <w:szCs w:val="20"/>
+                <w:sz w:val="18"/>
+                <w:szCs w:val="18"/>
               </w:rPr>
               <w:t xml:space="preserve">curl -fsSL https://raw.githubusercontent.com/NonAlex1/SEAssistPlugin/main/uninstall.sh | bash</w:t>
             </w:r>
@@ -4246,6 +4748,28 @@
         </w:tc>
       </w:tr>
     </w:tbl>
+    <w:p>
+      <w:pPr>
+        <w:spacing w:after="0" w:before="80"/>
+      </w:pPr>
+      <w:r>
+        <w:rPr>
+          <w:rFonts w:ascii="Arial" w:cs="Arial" w:eastAsia="Arial" w:hAnsi="Arial"/>
+        </w:rPr>
+        <w:t xml:space="preserve"/>
+      </w:r>
+    </w:p>
+    <w:p>
+      <w:pPr>
+        <w:spacing w:after="120" w:before="0"/>
+      </w:pPr>
+      <w:r>
+        <w:rPr>
+          <w:rFonts w:ascii="Arial" w:cs="Arial" w:eastAsia="Arial" w:hAnsi="Arial"/>
+        </w:rPr>
+        <w:t xml:space="preserve">The uninstaller stops the proxy, removes the LaunchAgent, and deletes ~/.seassist/. CA certificates installed in your keychain are left in place (they are company certificates and may be used by other tools).</w:t>
+      </w:r>
+    </w:p>
     <w:p>
       <w:pPr>
         <w:spacing w:after="0" w:before="120"/>
@@ -4333,9 +4857,9 @@
             </w:tcBorders>
             <w:shd w:fill="1E293B" w:val="clear"/>
             <w:tcMar>
-              <w:top w:type="dxa" w:w="100"/>
+              <w:top w:type="dxa" w:w="120"/>
               <w:left w:type="dxa" w:w="200"/>
-              <w:bottom w:type="dxa" w:w="100"/>
+              <w:bottom w:type="dxa" w:w="120"/>
               <w:right w:type="dxa" w:w="200"/>
             </w:tcMar>
           </w:tcPr>
@@ -4344,8 +4868,8 @@
               <w:rPr>
                 <w:rFonts w:ascii="Courier New" w:cs="Courier New" w:eastAsia="Courier New" w:hAnsi="Courier New"/>
                 <w:color w:val="86EFAC"/>
-                <w:sz w:val="20"/>
-                <w:szCs w:val="20"/>
+                <w:sz w:val="18"/>
+                <w:szCs w:val="18"/>
               </w:rPr>
               <w:t xml:space="preserve">irm https://raw.githubusercontent.com/NonAlex1/SEAssistPlugin/main/uninstall.ps1 | iex</w:t>
             </w:r>
@@ -4381,7 +4905,191 @@
           <w:sz w:val="36"/>
           <w:szCs w:val="36"/>
         </w:rPr>
-        <w:t xml:space="preserve">8. Support &amp; Updates</w:t>
+        <w:t xml:space="preserve">8. Updates</w:t>
+      </w:r>
+    </w:p>
+    <w:p>
+      <w:pPr>
+        <w:pStyle w:val="Heading2"/>
+        <w:spacing w:after="120" w:before="280"/>
+      </w:pPr>
+      <w:r>
+        <w:rPr>
+          <w:rFonts w:ascii="Arial" w:cs="Arial" w:eastAsia="Arial" w:hAnsi="Arial"/>
+          <w:b/>
+          <w:bCs/>
+          <w:color w:val="1E1B4B"/>
+          <w:sz w:val="28"/>
+          <w:szCs w:val="28"/>
+        </w:rPr>
+        <w:t xml:space="preserve">Automatic updates (proxy)</w:t>
+      </w:r>
+    </w:p>
+    <w:p>
+      <w:pPr>
+        <w:spacing w:after="80" w:before="0"/>
+      </w:pPr>
+      <w:r>
+        <w:rPr>
+          <w:rFonts w:ascii="Arial" w:cs="Arial" w:eastAsia="Arial" w:hAnsi="Arial"/>
+        </w:rPr>
+        <w:t xml:space="preserve">The proxy server checks GitHub for a new version every 6 hours and updates itself automatically. No user action is needed. You can verify the running version in the proxy log:</w:t>
+      </w:r>
+    </w:p>
+    <w:tbl>
+      <w:tblPr>
+        <w:tblW w:type="dxa" w:w="9360"/>
+        <w:tblBorders>
+          <w:top w:val="single" w:color="auto" w:sz="4"/>
+          <w:left w:val="single" w:color="auto" w:sz="4"/>
+          <w:bottom w:val="single" w:color="auto" w:sz="4"/>
+          <w:right w:val="single" w:color="auto" w:sz="4"/>
+          <w:insideH w:val="single" w:color="auto" w:sz="4"/>
+          <w:insideV w:val="single" w:color="auto" w:sz="4"/>
+        </w:tblBorders>
+      </w:tblPr>
+      <w:tblGrid>
+        <w:gridCol w:w="9360"/>
+      </w:tblGrid>
+      <w:tr>
+        <w:tc>
+          <w:tcPr>
+            <w:tcW w:type="dxa" w:w="9360"/>
+            <w:tcBorders>
+              <w:top w:val="nil" w:color="FFFFFF" w:sz="0"/>
+              <w:left w:val="nil" w:color="FFFFFF" w:sz="0"/>
+              <w:bottom w:val="nil" w:color="FFFFFF" w:sz="0"/>
+              <w:right w:val="nil" w:color="FFFFFF" w:sz="0"/>
+            </w:tcBorders>
+            <w:shd w:fill="1E293B" w:val="clear"/>
+            <w:tcMar>
+              <w:top w:type="dxa" w:w="120"/>
+              <w:left w:type="dxa" w:w="200"/>
+              <w:bottom w:type="dxa" w:w="120"/>
+              <w:right w:type="dxa" w:w="200"/>
+            </w:tcMar>
+          </w:tcPr>
+          <w:p>
+            <w:r>
+              <w:rPr>
+                <w:rFonts w:ascii="Courier New" w:cs="Courier New" w:eastAsia="Courier New" w:hAnsi="Courier New"/>
+                <w:color w:val="86EFAC"/>
+                <w:sz w:val="18"/>
+                <w:szCs w:val="18"/>
+              </w:rPr>
+              <w:t xml:space="preserve">tail -5 ~/.seassist/logs/proxy.log</w:t>
+            </w:r>
+          </w:p>
+        </w:tc>
+      </w:tr>
+    </w:tbl>
+    <w:p>
+      <w:pPr>
+        <w:spacing w:after="0" w:before="120"/>
+      </w:pPr>
+      <w:r>
+        <w:rPr>
+          <w:rFonts w:ascii="Arial" w:cs="Arial" w:eastAsia="Arial" w:hAnsi="Arial"/>
+        </w:rPr>
+        <w:t xml:space="preserve"/>
+      </w:r>
+    </w:p>
+    <w:p>
+      <w:pPr>
+        <w:pStyle w:val="Heading2"/>
+        <w:spacing w:after="120" w:before="280"/>
+      </w:pPr>
+      <w:r>
+        <w:rPr>
+          <w:rFonts w:ascii="Arial" w:cs="Arial" w:eastAsia="Arial" w:hAnsi="Arial"/>
+          <w:b/>
+          <w:bCs/>
+          <w:color w:val="1E1B4B"/>
+          <w:sz w:val="28"/>
+          <w:szCs w:val="28"/>
+        </w:rPr>
+        <w:t xml:space="preserve">Add-in frontend</w:t>
+      </w:r>
+    </w:p>
+    <w:p>
+      <w:pPr>
+        <w:spacing w:after="80" w:before="0"/>
+      </w:pPr>
+      <w:r>
+        <w:rPr>
+          <w:rFonts w:ascii="Arial" w:cs="Arial" w:eastAsia="Arial" w:hAnsi="Arial"/>
+        </w:rPr>
+        <w:t xml:space="preserve">The add-in UI is hosted on GitHub Pages and updates automatically whenever the repository is updated. No reinstallation or manifest change is needed.</w:t>
+      </w:r>
+    </w:p>
+    <w:p>
+      <w:pPr>
+        <w:spacing w:after="0" w:before="120"/>
+      </w:pPr>
+      <w:r>
+        <w:rPr>
+          <w:rFonts w:ascii="Arial" w:cs="Arial" w:eastAsia="Arial" w:hAnsi="Arial"/>
+        </w:rPr>
+        <w:t xml:space="preserve"/>
+      </w:r>
+    </w:p>
+    <w:p>
+      <w:pPr>
+        <w:pStyle w:val="Heading2"/>
+        <w:spacing w:after="120" w:before="280"/>
+      </w:pPr>
+      <w:r>
+        <w:rPr>
+          <w:rFonts w:ascii="Arial" w:cs="Arial" w:eastAsia="Arial" w:hAnsi="Arial"/>
+          <w:b/>
+          <w:bCs/>
+          <w:color w:val="1E1B4B"/>
+          <w:sz w:val="28"/>
+          <w:szCs w:val="28"/>
+        </w:rPr>
+        <w:t xml:space="preserve">Certificate renewal</w:t>
+      </w:r>
+    </w:p>
+    <w:p>
+      <w:pPr>
+        <w:spacing w:after="80" w:before="0"/>
+      </w:pPr>
+      <w:r>
+        <w:rPr>
+          <w:rFonts w:ascii="Arial" w:cs="Arial" w:eastAsia="Arial" w:hAnsi="Arial"/>
+        </w:rPr>
+        <w:t xml:space="preserve">The PKI certificate expires April 7, 2027. When renewed, a new seassist.crt and seassist.key will be published to the repository and the proxy self-update will distribute them automatically within 6 hours.</w:t>
+      </w:r>
+    </w:p>
+    <w:p>
+      <w:pPr>
+        <w:spacing w:after="0" w:before="200"/>
+      </w:pPr>
+      <w:r>
+        <w:rPr>
+          <w:rFonts w:ascii="Arial" w:cs="Arial" w:eastAsia="Arial" w:hAnsi="Arial"/>
+        </w:rPr>
+        <w:t xml:space="preserve"/>
+      </w:r>
+    </w:p>
+    <w:p>
+      <w:pPr>
+        <w:pStyle w:val="Heading1"/>
+        <w:pBdr>
+          <w:bottom w:val="single" w:color="1E1B4B" w:sz="8" w:space="4"/>
+        </w:pBdr>
+        <w:spacing w:after="160" w:before="360"/>
+      </w:pPr>
+      <w:r>
+        <w:rPr>
+          <w:rFonts w:ascii="Arial" w:cs="Arial" w:eastAsia="Arial" w:hAnsi="Arial"/>
+          <w:b/>
+          <w:bCs/>
+          <w:color w:val="1E1B4B"/>
+          <w:sz w:val="36"/>
+          <w:szCs w:val="36"/>
+        </w:rPr>
+        <w:t xml:space="preserve">9. Support &amp; Resources</w:t>
       </w:r>
     </w:p>
     <w:p>
@@ -4399,7 +5107,7 @@
         </w:rPr>
         <w:t xml:space="preserve">Source code &amp; issues: </w:t>
       </w:r>
-      <w:hyperlink w:history="1" r:id="rIdiuofnd30mzlbwm3fdkujr">
+      <w:hyperlink w:history="1" r:id="rIdiev-0fhpdms6m_bssmord">
         <w:r>
           <w:rPr>
             <w:rFonts w:ascii="Arial" w:cs="Arial" w:eastAsia="Arial" w:hAnsi="Arial"/>
@@ -4423,8 +5131,18 @@
         <w:rPr>
           <w:rFonts w:ascii="Arial" w:cs="Arial" w:eastAsia="Arial" w:hAnsi="Arial"/>
         </w:rPr>
-        <w:t xml:space="preserve">Updates are delivered automatically — the add-in frontend is hosted on GitHub Pages and updates whenever the repository is updated. No reinstallation needed.</w:t>
-      </w:r>
+        <w:t xml:space="preserve">Manifest URL: </w:t>
+      </w:r>
+      <w:hyperlink w:history="1" r:id="rIdvgp5dzegiuy68mmh-2pdi">
+        <w:r>
+          <w:rPr>
+            <w:rFonts w:ascii="Arial" w:cs="Arial" w:eastAsia="Arial" w:hAnsi="Arial"/>
+            <w:color w:val="2563EB"/>
+            <w:u w:val="single"/>
+          </w:rPr>
+          <w:t xml:space="preserve">nonalex1.github.io/SEAssistPlugin/manifest.xml</w:t>
+        </w:r>
+      </w:hyperlink>
     </w:p>
     <w:p>
       <w:pPr>
@@ -4439,7 +5157,7 @@
         <w:rPr>
           <w:rFonts w:ascii="Arial" w:cs="Arial" w:eastAsia="Arial" w:hAnsi="Arial"/>
         </w:rPr>
-        <w:t xml:space="preserve">Proxy updates: re-run the install script to get the latest proxy server. Existing authentication is preserved.</w:t>
+        <w:t xml:space="preserve">Salesforce object: Global_SE_Assist__c on extremesaas.lightning.force.com</w:t>
       </w:r>
     </w:p>
     <w:p>
@@ -4455,7 +5173,23 @@
         <w:rPr>
           <w:rFonts w:ascii="Arial" w:cs="Arial" w:eastAsia="Arial" w:hAnsi="Arial"/>
         </w:rPr>
-        <w:t xml:space="preserve">Salesforce object: Global_SE_Assist__c on extremesaas.lightning.force.com</w:t>
+        <w:t xml:space="preserve">Proxy logs (Mac): ~/.seassist/logs/proxy.log</w:t>
+      </w:r>
+    </w:p>
+    <w:p>
+      <w:pPr>
+        <w:pStyle w:val="ListParagraph"/>
+        <w:numPr>
+          <w:ilvl w:val="0"/>
+          <w:numId w:val="2"/>
+        </w:numPr>
+        <w:spacing w:after="40" w:before="40"/>
+      </w:pPr>
+      <w:r>
+        <w:rPr>
+          <w:rFonts w:ascii="Arial" w:cs="Arial" w:eastAsia="Arial" w:hAnsi="Arial"/>
+        </w:rPr>
+        <w:t xml:space="preserve">Proxy logs (Windows): %USERPROFILE%\.seassist\logs\proxy.log</w:t>
       </w:r>
     </w:p>
     <w:p>
@@ -4693,7 +5427,7 @@
         <w:sz w:val="18"/>
         <w:szCs w:val="18"/>
       </w:rPr>
-      <w:t xml:space="preserve">SE Assist for Outlook — User Guide</w:t>
+      <w:t xml:space="preserve">SE Assist for Outlook — User Guide  v1.1</w:t>
     </w:r>
   </w:p>
 </w:hdr>
@@ -4815,15 +5549,6 @@
       <w:lvlJc w:val="left"/>
       <w:pPr>
         <w:ind w:left="720" w:hanging="360"/>
-      </w:pPr>
-    </w:lvl>
-    <w:lvl w:ilvl="1" w15:tentative="1">
-      <w:start w:val="1"/>
-      <w:numFmt w:val="lowerLetter"/>
-      <w:lvlText w:val="%2."/>
-      <w:lvlJc w:val="left"/>
-      <w:pPr>
-        <w:ind w:left="1080" w:hanging="360"/>
       </w:pPr>
     </w:lvl>
   </w:abstractNum>

</xml_diff>